<commit_message>
docs: Report tyre-cliff limitation honestly
Document the real 3/5 strategy agreement, 1/4 tyre-cliff result, Canada miss, root-cause analysis, and Azerbaijan demo path in submission materials.
</commit_message>
<xml_diff>
--- a/docs/PitSense_PRD.docx
+++ b/docs/PitSense_PRD.docx
@@ -5924,6 +5924,80 @@
         </w:tc>
       </w:tr>
     </w:tbl>
+    <w:p>
+      <w:r>
+        <w:br w:type="page"/>
+      </w:r>
+    </w:p>
+    <w:p>
+      <w:r>
+        <w:rPr>
+          <w:b/>
+        </w:rPr>
+        <w:t>Build Validation Addendum</w:t>
+      </w:r>
+    </w:p>
+    <w:p>
+      <w:r>
+        <w:t>Section 9 was executed against five completed FastF1 Race sessions: 2024 Canada, 2023 Netherlands, 2024 Australia, 2024 British Grand Prix, and 2024 Azerbaijan.</w:t>
+      </w:r>
+    </w:p>
+    <w:p>
+      <w:r>
+        <w:t>Verified results:</w:t>
+      </w:r>
+    </w:p>
+    <w:p>
+      <w:r>
+        <w:t>- Directional pit-window agreement: 3/5, meeting the reported target.</w:t>
+      </w:r>
+    </w:p>
+    <w:p>
+      <w:r>
+        <w:t>- Tyre-cliff accuracy: 1/4 detected cliff onsets within +/-2 laps.</w:t>
+      </w:r>
+    </w:p>
+    <w:p>
+      <w:r>
+        <w:t>- Maximum measured real Shock Event re-optimization: 0.22966 seconds.</w:t>
+      </w:r>
+    </w:p>
+    <w:p>
+      <w:r>
+        <w:t>- Real replay ticks processed: 303.</w:t>
+      </w:r>
+    </w:p>
+    <w:p>
+      <w:r>
+        <w:t>- Safety Car/VSC evidence: 4/5 races; wet/intermediate evidence: 5/5 races.</w:t>
+      </w:r>
+    </w:p>
+    <w:p>
+      <w:r>
+        <w:rPr>
+          <w:b/>
+        </w:rPr>
+        <w:t>Known Limitation: Tyre-Cliff Detection</w:t>
+      </w:r>
+    </w:p>
+    <w:p>
+      <w:r>
+        <w:t>The current detector uses a median baseline and MAD-based hard threshold per contiguous compound stint, requiring three consecutive laps above the threshold. Root-cause analysis found three stints too short for a curve estimate and eight stints with no threshold crossing. Wet-condition pace and compound transitions contaminate the assumption that one stint is a clean degradation curve. Canada is the clearest miss: the model proposed lap 18 while the actual winner stop was lap 46. This result is reported as a known limitation; it is not removed from the validation record.</w:t>
+      </w:r>
+    </w:p>
+    <w:p>
+      <w:r>
+        <w:rPr>
+          <w:b/>
+        </w:rPr>
+        <w:t>Demo Positioning</w:t>
+      </w:r>
+    </w:p>
+    <w:p>
+      <w:r>
+        <w:t>Use 2023 Netherlands or 2024 Azerbaijan for the primary walkthrough. Use 2024 Canada as the deliberate limitation case and explain that the next modeling step is condition-aware separation of wet pace, compound changes, and gradual tyre wear.</w:t>
+      </w:r>
+    </w:p>
     <w:sectPr>
       <w:headerReference w:type="default" r:id="rId7"/>
       <w:footerReference w:type="default" r:id="rId8"/>

</xml_diff>